<commit_message>
Reescribir el inicio de la clínica del V5 sin citar la NICE
- Párrafo inicial de §1.1: «Casi todos los pacientes tienen al menos
  dos de estos datos [...]. Pero menos de la mitad los tienen todos: con
  dos de ellos ya hay que plantearse una MBA». Se apoya en la SEN y en el
  estudio que cita; FUENTES §9.5 registra el umbral de dos datos como
  interpretación del dato del 95 %.
- Viñeta de la tríada acortada para no repetir los cuatro síntomas.
- Referencia de la NICE: se retira «la combinación de alarma».

Co-Authored-By: Claude Opus 5.5 <noreply@anthropic.com>
Claude-Session: https://claude.ai/code/session_01SuFTpZRRYqJBrnXKTinJ8Y
</commit_message>
<xml_diff>
--- a/entregables/Meningitis_bacteriana_aguda_revisadoV5.docx
+++ b/entregables/Meningitis_bacteriana_aguda_revisadoV5.docx
@@ -1365,31 +1365,28 @@
         <w:keepLines/>
       </w:pPr>
       <w:r>
+        <w:rPr/>
+        <w:t xml:space="preserve">Casi todos los pacientes tienen al menos dos de estos datos: </w:t>
+      </w:r>
+      <w:r>
         <w:rPr>
           <w:b/>
         </w:rPr>
-        <w:t xml:space="preserve">Combinación de alarma</w:t>
-      </w:r>
-      <w:r>
-        <w:t xml:space="preserve"> (NICE 1.1.4‑1.1.5): </w:t>
+        <w:t xml:space="preserve">FIEBRE, CEFALEA, RIGIDEZ DE NUCA Y ALTERACIÓN DEL ESTADO MENTAL</w:t>
+      </w:r>
+      <w:r>
+        <w:rPr/>
+        <w:t xml:space="preserve">. Pero menos de la mitad los tienen todos: </w:t>
       </w:r>
       <w:r>
         <w:rPr>
           <w:b/>
         </w:rPr>
-        <w:t xml:space="preserve">FIEBRE + CEFALEA + RIGIDEZ DE NUCA + ALTERACIÓN DEL NIVEL DE CONSCIENCIA O DE LA COGNICIÓN (confusión, delirium)</w:t>
-      </w:r>
-      <w:r>
-        <w:t xml:space="preserve">. Con las cuatro, mantener una </w:t>
-      </w:r>
-      <w:r>
-        <w:rPr>
-          <w:b/>
-        </w:rPr>
-        <w:t xml:space="preserve">alta sospecha clínica</w:t>
-      </w:r>
-      <w:r>
-        <w:t xml:space="preserve"> de MBA, aunque la sospecha fuerte también puede basarse en el juicio clínico sin la combinación completa.</w:t>
+        <w:t xml:space="preserve">con dos de ellos ya hay que plantearse una MBA</w:t>
+      </w:r>
+      <w:r>
+        <w:rPr/>
+        <w:t xml:space="preserve">.</w:t>
       </w:r>
     </w:p>
     <w:p>
@@ -1424,17 +1421,11 @@
       </w:r>
       <w:r>
         <w:rPr/>
-        <w:t xml:space="preserve"> de los adultos (SEN 2025; 41‑51 % según la ESCMID), pero </w:t>
-      </w:r>
-      <w:r>
-        <w:rPr>
-          <w:b/>
-        </w:rPr>
-        <w:t xml:space="preserve">el 95 % tiene al menos dos de cuatro síntomas: cefalea, fiebre, rigidez de nuca y alteración del estado mental</w:t>
+        <w:t xml:space="preserve"> de los adultos (SEN 2025; 41‑51 % según la ESCMID)</w:t>
       </w:r>
       <w:r>
         <w:rPr/>
-        <w:t xml:space="preserve"> (estudio holandés citado por la SEN 2025).</w:t>
+        <w:t xml:space="preserve">; el 95 % tiene al menos dos de los cuatro datos (estudio holandés citado por la SEN 2025).</w:t>
       </w:r>
       <w:r>
         <w:t xml:space="preserve"> Para predecir pleocitosis, la sensibilidad es baja: </w:t>
@@ -14937,7 +14928,7 @@
           <w:sz w:val="20"/>
           <w:szCs w:val="20"/>
         </w:rPr>
-        <w:t>La combinación de alarma, las presentaciones atípicas y las causas alternativas.</w:t>
+        <w:t xml:space="preserve">Las presentaciones atípicas y las causas alternativas.</w:t>
       </w:r>
     </w:p>
     <w:p>

</xml_diff>